<commit_message>
5 galdera praktiko gehitu kontsolako irteerekin
whois, dig TXT/MX, nslookup AAAA eta dig TTL irteerak
TryHackMe estiloan, aukera teorikoen artean.

Co-authored-by: jazkune-izarraitz <jazkune-izarraitz@users.noreply.github.com>
</commit_message>
<xml_diff>
--- a/testak/Ezagutze_pasiboa_testa.docx
+++ b/testak/Ezagutze_pasiboa_testa.docx
@@ -23,11 +23,13 @@
         <w:t>TryHackMe: Passive Reconnaissance eta DNS in Detail</w:t>
         <w:br/>
         <w:t>15 galdera · 3 aukera (aukera bakarra zuzena da)</w:t>
+        <w:br/>
+        <w:t>5 galdera praktikoak (kontsola): 4, 6, 7, 11, 14</w:t>
       </w:r>
     </w:p>
     <w:p>
       <w:r>
-        <w:t>Jarraibideak: Galdera bakoitzean aukeratu erantzun zuzena (a, b edo c). Erantzunak dokumentuko hurrengo orrialdean daude.</w:t>
+        <w:t>Jarraibideak: Galdera bakoitzean aukeratu erantzun zuzena (a, b edo c). Galdera praktikoetan, irakurri kontsolako irteera eta erantzun horren arabera. Erantzunak dokumentuko hurrengo orrialdean daude.</w:t>
       </w:r>
     </w:p>
     <w:p/>
@@ -108,22 +110,55 @@
         <w:rPr>
           <w:b/>
         </w:rPr>
-        <w:t>4. WHOIS protokoloak zer informazio ematen du normalean?</w:t>
+        <w:t>4. WHOIS irteera honetan, noiz erregistratu zen tryhackme.com? [praktikoa]</w:t>
+      </w:r>
+    </w:p>
+    <w:p>
+      <w:pPr>
+        <w:spacing w:before="120" w:after="120"/>
+        <w:ind w:left="142"/>
+        <w:shd w:val="clear" w:color="auto" w:fill="F0F0F0"/>
+      </w:pPr>
+      <w:r>
+        <w:rPr>
+          <w:rFonts w:ascii="Consolas" w:hAnsi="Consolas" w:eastAsia="Consolas"/>
+          <w:color w:val="1A1A1A"/>
+          <w:sz w:val="17"/>
+        </w:rPr>
+        <w:t>ubuntu@tryhackme$ whois tryhackme.com</w:t>
+        <w:br/>
+        <w:t>[Querying whois.verisign-grs.com]</w:t>
+        <w:br/>
+        <w:t>[Redirected to whois.namecheap.com]</w:t>
+        <w:br/>
+        <w:t>Domain Name: TRYHACKME.COM</w:t>
+        <w:br/>
+        <w:t>Registrar: NAMECHEAP INC</w:t>
+        <w:br/>
+        <w:t>Creation Date: 2018-07-05T19:46:15.00Z</w:t>
+        <w:br/>
+        <w:t>Updated Date: 2021-05-01T19:43:23.31Z</w:t>
+        <w:br/>
+        <w:t>Registrar Registration Expiration Date: 2027-07-05T19:46:15.00Z</w:t>
+        <w:br/>
+        <w:t>Name Server: NS1.CLOUDFLARE.COM</w:t>
+        <w:br/>
+        <w:t>Name Server: NS2.CLOUDFLARE.COM</w:t>
       </w:r>
     </w:p>
     <w:p>
       <w:r>
-        <w:t>a) Zerbitzariaren root pasahitza eta irekitako ataka guztiak.</w:t>
+        <w:t>a) 2021-05-01</w:t>
       </w:r>
     </w:p>
     <w:p>
       <w:r>
-        <w:t>b) Domeinuaren erregistro-datuak: erregistratzailea, datak, name-zerbitzariak, etab.</w:t>
+        <w:t>b) 2018-07-05</w:t>
       </w:r>
     </w:p>
     <w:p>
       <w:r>
-        <w:t>c) Domeinuaren erregistro-datuak eta webguneko HTML kode osoa.</w:t>
+        <w:t>c) 2027-07-05</w:t>
       </w:r>
     </w:p>
     <w:p/>
@@ -156,22 +191,54 @@
         <w:rPr>
           <w:b/>
         </w:rPr>
-        <w:t>6. nslookup eta dig tresnek zertarako balio dute?</w:t>
+        <w:t>6. dig irteera honetan, zein da thmlabs.com domeinuaren TXT erregistroaren balioa? [praktikoa]</w:t>
+      </w:r>
+    </w:p>
+    <w:p>
+      <w:pPr>
+        <w:spacing w:before="120" w:after="120"/>
+        <w:ind w:left="142"/>
+        <w:shd w:val="clear" w:color="auto" w:fill="F0F0F0"/>
+      </w:pPr>
+      <w:r>
+        <w:rPr>
+          <w:rFonts w:ascii="Consolas" w:hAnsi="Consolas" w:eastAsia="Consolas"/>
+          <w:color w:val="1A1A1A"/>
+          <w:sz w:val="17"/>
+        </w:rPr>
+        <w:t>ubuntu@tryhackme$ dig thmlabs.com TXT</w:t>
+        <w:br/>
+        <w:br/>
+        <w:t>; &lt;&lt;&gt;&gt; DiG 9.16.1-Ubuntu &lt;&lt;&gt;&gt; thmlabs.com TXT</w:t>
+        <w:br/>
+        <w:t>;; QUESTION SECTION:</w:t>
+        <w:br/>
+        <w:t>;thmlabs.com.                   IN      TXT</w:t>
+        <w:br/>
+        <w:br/>
+        <w:t>;; ANSWER SECTION:</w:t>
+        <w:br/>
+        <w:t>thmlabs.com.            300     IN      TXT     "THM{a5b83929888ed36acb0272971e438d78}"</w:t>
+        <w:br/>
+        <w:br/>
+        <w:t>;; Query time: 28 msec</w:t>
+        <w:br/>
+        <w:t>;; SERVER: 1.1.1.1#53(1.1.1.1)</w:t>
       </w:r>
     </w:p>
     <w:p>
       <w:r>
-        <w:t>a) DNS erregistroak kontsultatzeko (A, MX, TXT, etab.).</w:t>
+        <w:t>a) "THM{a5b83929888ed36acb0272971e438d78}"</w:t>
       </w:r>
     </w:p>
     <w:p>
       <w:r>
-        <w:t>b) WHOIS erregistroak soilik bilatzeko.</w:t>
+        <w:t>b) 300 (TTL balioa da bandera)</w:t>
       </w:r>
     </w:p>
     <w:p>
       <w:r>
-        <w:t>c) DNS erregistroak kontsultatzeko eta, gainera, atakak eskaneatzeko.</w:t>
+        <w:t>c) 1.1.1.1 (DNS zerbitzariaren IP-a da bandera)</w:t>
       </w:r>
     </w:p>
     <w:p/>
@@ -180,22 +247,53 @@
         <w:rPr>
           <w:b/>
         </w:rPr>
-        <w:t>7. dig tresnari buruz, zein baieztapen da zuzena?</w:t>
+        <w:t>7. Komando hau exekutatzen duzu. Zertarako balio du zehazki? [praktikoa]</w:t>
+      </w:r>
+    </w:p>
+    <w:p>
+      <w:pPr>
+        <w:spacing w:before="120" w:after="120"/>
+        <w:ind w:left="142"/>
+        <w:shd w:val="clear" w:color="auto" w:fill="F0F0F0"/>
+      </w:pPr>
+      <w:r>
+        <w:rPr>
+          <w:rFonts w:ascii="Consolas" w:hAnsi="Consolas" w:eastAsia="Consolas"/>
+          <w:color w:val="1A1A1A"/>
+          <w:sz w:val="17"/>
+        </w:rPr>
+        <w:t>ubuntu@tryhackme$ dig @1.1.1.1 tryhackme.com MX</w:t>
+        <w:br/>
+        <w:br/>
+        <w:t>; &lt;&lt;&gt;&gt; DiG 9.16.1-Ubuntu &lt;&lt;&gt;&gt; @1.1.1.1 tryhackme.com MX</w:t>
+        <w:br/>
+        <w:t>;; QUESTION SECTION:</w:t>
+        <w:br/>
+        <w:t>;tryhackme.com.                 IN      MX</w:t>
+        <w:br/>
+        <w:br/>
+        <w:t>;; ANSWER SECTION:</w:t>
+        <w:br/>
+        <w:t>tryhackme.com.          300     IN      MX      10 alt1.aspmx.l.google.com.</w:t>
+        <w:br/>
+        <w:t>tryhackme.com.          300     IN      MX      20 alt2.aspmx.l.google.com.</w:t>
+        <w:br/>
+        <w:t>tryhackme.com.          300     IN      MX      30 aspmx.l.google.com.</w:t>
       </w:r>
     </w:p>
     <w:p>
       <w:r>
-        <w:t>a) Webguneak deskargatzeko eta HTML analizatzeko tresna da.</w:t>
+        <w:t>a) tryhackme.com-en posta-zerbitzariak (MX) kontsultatzea Cloudflare DNS (1.1.1.1) erabiliz.</w:t>
       </w:r>
     </w:p>
     <w:p>
       <w:r>
-        <w:t>b) DNS kontsultetarako tresna modernoa da, baina TTL balioak inoiz ez ditu erakusten.</w:t>
+        <w:t>b) tryhackme.com-en A (IPv4) erregistroak kontsultatzea 1.1.1.1 zerbitzarian.</w:t>
       </w:r>
     </w:p>
     <w:p>
       <w:r>
-        <w:t>c) DNS kontsultetarako tresna modernoa da; TTL balioak erakusten ditu eta nslookup baino xehetasun gehiago ematen du.</w:t>
+        <w:t>c) tryhackme.com-en WHOIS datuak lortzea TCP 43 atakan.</w:t>
       </w:r>
     </w:p>
     <w:p/>
@@ -276,22 +374,49 @@
         <w:rPr>
           <w:b/>
         </w:rPr>
-        <w:t>11. Zein erregistro motak kudeatzen ditu IPv6 helbideak?</w:t>
+        <w:t>11. nslookup irteera honetan, zein erregistro mota agertzen da eta zer IP mota da? [praktikoa]</w:t>
+      </w:r>
+    </w:p>
+    <w:p>
+      <w:pPr>
+        <w:spacing w:before="120" w:after="120"/>
+        <w:ind w:left="142"/>
+        <w:shd w:val="clear" w:color="auto" w:fill="F0F0F0"/>
+      </w:pPr>
+      <w:r>
+        <w:rPr>
+          <w:rFonts w:ascii="Consolas" w:hAnsi="Consolas" w:eastAsia="Consolas"/>
+          <w:color w:val="1A1A1A"/>
+          <w:sz w:val="17"/>
+        </w:rPr>
+        <w:t>ubuntu@tryhackme$ nslookup -type=AAAA website.thm</w:t>
+        <w:br/>
+        <w:br/>
+        <w:t>Server:         1.1.1.1</w:t>
+        <w:br/>
+        <w:t>Address:        1.1.1.1#53</w:t>
+        <w:br/>
+        <w:br/>
+        <w:t>Non-authoritative answer:</w:t>
+        <w:br/>
+        <w:t>Name:   website.thm</w:t>
+        <w:br/>
+        <w:t>Address: 2606:4700:20::681a:be5</w:t>
       </w:r>
     </w:p>
     <w:p>
       <w:r>
-        <w:t>a) AAAA</w:t>
+        <w:t>a) AAAA erregistroa → IPv6 helbidea</w:t>
       </w:r>
     </w:p>
     <w:p>
       <w:r>
-        <w:t>b) MX</w:t>
+        <w:t>b) A erregistroa → IPv6 helbidea ere onartzen duelako</w:t>
       </w:r>
     </w:p>
     <w:p>
       <w:r>
-        <w:t>c) A (IPv6 ere onartzen duelako)</w:t>
+        <w:t>c) MX erregistroa → posta-zerbitzariaren IPv6-a</w:t>
       </w:r>
     </w:p>
     <w:p/>
@@ -300,7 +425,7 @@
         <w:rPr>
           <w:b/>
         </w:rPr>
-        <w:t>12. Zeinek erregistro motak adierazten du nora bidali behar den posta elektronikoa?</w:t>
+        <w:t>12. Zein erregistro motak adierazten du nora bidali behar den posta elektronikoa?</w:t>
       </w:r>
     </w:p>
     <w:p>
@@ -348,22 +473,47 @@
         <w:rPr>
           <w:b/>
         </w:rPr>
-        <w:t>14. TTL eremuan zer zehazten da?</w:t>
+        <w:t>14. dig irteera honetan, zenbat segundo gorde daiteke erregistroa cachean (TTL)? [praktikoa]</w:t>
+      </w:r>
+    </w:p>
+    <w:p>
+      <w:pPr>
+        <w:spacing w:before="120" w:after="120"/>
+        <w:ind w:left="142"/>
+        <w:shd w:val="clear" w:color="auto" w:fill="F0F0F0"/>
+      </w:pPr>
+      <w:r>
+        <w:rPr>
+          <w:rFonts w:ascii="Consolas" w:hAnsi="Consolas" w:eastAsia="Consolas"/>
+          <w:color w:val="1A1A1A"/>
+          <w:sz w:val="17"/>
+        </w:rPr>
+        <w:t>ubuntu@tryhackme$ dig www.website.thm A</w:t>
+        <w:br/>
+        <w:br/>
+        <w:t>;; QUESTION SECTION:</w:t>
+        <w:br/>
+        <w:t>;www.website.thm.               IN      A</w:t>
+        <w:br/>
+        <w:br/>
+        <w:t>;; ANSWER SECTION:</w:t>
+        <w:br/>
+        <w:t>www.website.thm.        3600    IN      A       10.10.10.10</w:t>
       </w:r>
     </w:p>
     <w:p>
       <w:r>
-        <w:t>a) Zenbat denboraz cachean gorde daitekeen DNS erregistro bat.</w:t>
+        <w:t>a) 3600 segundo</w:t>
       </w:r>
     </w:p>
     <w:p>
       <w:r>
-        <w:t>b) Domeinuaren erregistroaren iraungitze-data WHOIS-en.</w:t>
+        <w:t>b) 10 segundo (IP-aren azken oktetoa)</w:t>
       </w:r>
     </w:p>
     <w:p>
       <w:r>
-        <w:t>c) Zenbat denboraz cachean gorde daitekeen, baina soilik MX erregistroetan.</w:t>
+        <w:t>c) 53 segundo (DNS ataka)</w:t>
       </w:r>
     </w:p>
     <w:p/>
@@ -372,7 +522,7 @@
         <w:rPr>
           <w:b/>
         </w:rPr>
-        <w:t>15. Zeinek DNS zerbitzari motak gordetzen ditu domeinu baten erregistro guztiak?</w:t>
+        <w:t>15. Zein DNS zerbitzari motak gordetzen ditu domeinu baten erregistro guztiak?</w:t>
       </w:r>
     </w:p>
     <w:p>
@@ -407,7 +557,7 @@
     </w:p>
     <w:p>
       <w:r>
-        <w:t>Galdera bakoitzean: erantzun zuzena, akats txikia eta akats handia azaltzen dira.</w:t>
+        <w:t>Galdera bakoitzean: erantzun zuzena, akats txikia eta akats handia azaltzen dira. Galdera praktikoak (kontsola): 4, 6, 7, 11, 14.</w:t>
       </w:r>
     </w:p>
     <w:p/>
@@ -419,7 +569,7 @@
         <w:t xml:space="preserve">1. </w:t>
       </w:r>
       <w:r>
-        <w:t>Zuzena: b) Helburuaren informazioa iturri publikoetatik biltzea, helburuarekin zuzenean kontaktatu gabe.</w:t>
+        <w:t xml:space="preserve"> Zuzena: b) Helburuaren informazioa iturri publikoetatik biltzea, helburuarekin zuzenean kontaktatu gabe.</w:t>
       </w:r>
     </w:p>
     <w:p>
@@ -447,7 +597,7 @@
         <w:t xml:space="preserve">2. </w:t>
       </w:r>
       <w:r>
-        <w:t>Zuzena: a) Pasiboa, informazio publikoa soilik erabiltzen delako.</w:t>
+        <w:t xml:space="preserve"> Zuzena: a) Pasiboa, informazio publikoa soilik erabiltzen delako.</w:t>
       </w:r>
     </w:p>
     <w:p>
@@ -475,7 +625,7 @@
         <w:t xml:space="preserve">3. </w:t>
       </w:r>
       <w:r>
-        <w:t>Zuzena: c) Aktiboa, helburuari paketeak bidaltzen zaizkiolako.</w:t>
+        <w:t xml:space="preserve"> Zuzena: c) Aktiboa, helburuari paketeak bidaltzen zaizkiolako.</w:t>
       </w:r>
     </w:p>
     <w:p>
@@ -503,7 +653,7 @@
         <w:t xml:space="preserve">4. </w:t>
       </w:r>
       <w:r>
-        <w:t>Zuzena: b) Domeinuaren erregistro-datuak: erregistratzailea, datak, name-zerbitzariak, etab.</w:t>
+        <w:t xml:space="preserve"> [praktikoa] Zuzena: b) 2018-07-05</w:t>
       </w:r>
     </w:p>
     <w:p>
@@ -511,7 +661,7 @@
         <w:pStyle w:val="ListBullet"/>
       </w:pPr>
       <w:r>
-        <w:t xml:space="preserve">   · Akats txikia: c) Domeinuaren erregistro-datuak eta webguneko HTML kode osoa.</w:t>
+        <w:t xml:space="preserve">   · Akats txikia: a) 2021-05-01</w:t>
       </w:r>
     </w:p>
     <w:p>
@@ -519,7 +669,7 @@
         <w:pStyle w:val="ListBullet"/>
       </w:pPr>
       <w:r>
-        <w:t xml:space="preserve">   · Akats handia: a) Zerbitzariaren root pasahitza eta irekitako ataka guztiak.</w:t>
+        <w:t xml:space="preserve">   · Akats handia: c) 2027-07-05</w:t>
       </w:r>
     </w:p>
     <w:p/>
@@ -531,7 +681,7 @@
         <w:t xml:space="preserve">5. </w:t>
       </w:r>
       <w:r>
-        <w:t>Zuzena: c) 43</w:t>
+        <w:t xml:space="preserve"> Zuzena: c) 43</w:t>
       </w:r>
     </w:p>
     <w:p>
@@ -559,7 +709,7 @@
         <w:t xml:space="preserve">6. </w:t>
       </w:r>
       <w:r>
-        <w:t>Zuzena: a) DNS erregistroak kontsultatzeko (A, MX, TXT, etab.).</w:t>
+        <w:t xml:space="preserve"> [praktikoa] Zuzena: a) "THM{a5b83929888ed36acb0272971e438d78}"</w:t>
       </w:r>
     </w:p>
     <w:p>
@@ -567,7 +717,7 @@
         <w:pStyle w:val="ListBullet"/>
       </w:pPr>
       <w:r>
-        <w:t xml:space="preserve">   · Akats txikia: c) DNS erregistroak kontsultatzeko eta, gainera, atakak eskaneatzeko.</w:t>
+        <w:t xml:space="preserve">   · Akats txikia: b) 300 (TTL balioa da bandera)</w:t>
       </w:r>
     </w:p>
     <w:p>
@@ -575,7 +725,7 @@
         <w:pStyle w:val="ListBullet"/>
       </w:pPr>
       <w:r>
-        <w:t xml:space="preserve">   · Akats handia: b) WHOIS erregistroak soilik bilatzeko.</w:t>
+        <w:t xml:space="preserve">   · Akats handia: c) 1.1.1.1 (DNS zerbitzariaren IP-a da bandera)</w:t>
       </w:r>
     </w:p>
     <w:p/>
@@ -587,7 +737,7 @@
         <w:t xml:space="preserve">7. </w:t>
       </w:r>
       <w:r>
-        <w:t>Zuzena: c) DNS kontsultetarako tresna modernoa da; TTL balioak erakusten ditu eta nslookup baino xehetasun gehiago ematen du.</w:t>
+        <w:t xml:space="preserve"> [praktikoa] Zuzena: a) tryhackme.com-en posta-zerbitzariak (MX) kontsultatzea Cloudflare DNS (1.1.1.1) erabiliz.</w:t>
       </w:r>
     </w:p>
     <w:p>
@@ -595,7 +745,7 @@
         <w:pStyle w:val="ListBullet"/>
       </w:pPr>
       <w:r>
-        <w:t xml:space="preserve">   · Akats txikia: b) DNS kontsultetarako tresna modernoa da, baina TTL balioak inoiz ez ditu erakusten.</w:t>
+        <w:t xml:space="preserve">   · Akats txikia: b) tryhackme.com-en A (IPv4) erregistroak kontsultatzea 1.1.1.1 zerbitzarian.</w:t>
       </w:r>
     </w:p>
     <w:p>
@@ -603,7 +753,7 @@
         <w:pStyle w:val="ListBullet"/>
       </w:pPr>
       <w:r>
-        <w:t xml:space="preserve">   · Akats handia: a) Webguneak deskargatzeko eta HTML analizatzeko tresna da.</w:t>
+        <w:t xml:space="preserve">   · Akats handia: c) tryhackme.com-en WHOIS datuak lortzea TCP 43 atakan.</w:t>
       </w:r>
     </w:p>
     <w:p/>
@@ -615,7 +765,7 @@
         <w:t xml:space="preserve">8. </w:t>
       </w:r>
       <w:r>
-        <w:t>Zuzena: b) Azpidomeinuak, DNS erregistroak eta azpiegituraren mapa bisuala lortzeko.</w:t>
+        <w:t xml:space="preserve"> Zuzena: b) Azpidomeinuak, DNS erregistroak eta azpiegituraren mapa bisuala lortzeko.</w:t>
       </w:r>
     </w:p>
     <w:p>
@@ -643,7 +793,7 @@
         <w:t xml:space="preserve">9. </w:t>
       </w:r>
       <w:r>
-        <w:t>Zuzena: b) Internetera konektatutako gailu eta zerbitzuen bilatzailea (OSINT).</w:t>
+        <w:t xml:space="preserve"> Zuzena: b) Internetera konektatutako gailu eta zerbitzuen bilatzailea (OSINT).</w:t>
       </w:r>
     </w:p>
     <w:p>
@@ -671,7 +821,7 @@
         <w:t xml:space="preserve">10. </w:t>
       </w:r>
       <w:r>
-        <w:t>Zuzena: c) Domain Name System</w:t>
+        <w:t xml:space="preserve"> Zuzena: c) Domain Name System</w:t>
       </w:r>
     </w:p>
     <w:p>
@@ -699,7 +849,7 @@
         <w:t xml:space="preserve">11. </w:t>
       </w:r>
       <w:r>
-        <w:t>Zuzena: a) AAAA</w:t>
+        <w:t xml:space="preserve"> [praktikoa] Zuzena: a) AAAA erregistroa → IPv6 helbidea</w:t>
       </w:r>
     </w:p>
     <w:p>
@@ -707,7 +857,7 @@
         <w:pStyle w:val="ListBullet"/>
       </w:pPr>
       <w:r>
-        <w:t xml:space="preserve">   · Akats txikia: c) A (IPv6 ere onartzen duelako)</w:t>
+        <w:t xml:space="preserve">   · Akats txikia: b) A erregistroa → IPv6 helbidea ere onartzen duelako</w:t>
       </w:r>
     </w:p>
     <w:p>
@@ -715,7 +865,7 @@
         <w:pStyle w:val="ListBullet"/>
       </w:pPr>
       <w:r>
-        <w:t xml:space="preserve">   · Akats handia: b) MX</w:t>
+        <w:t xml:space="preserve">   · Akats handia: c) MX erregistroa → posta-zerbitzariaren IPv6-a</w:t>
       </w:r>
     </w:p>
     <w:p/>
@@ -727,7 +877,7 @@
         <w:t xml:space="preserve">12. </w:t>
       </w:r>
       <w:r>
-        <w:t>Zuzena: b) MX</w:t>
+        <w:t xml:space="preserve"> Zuzena: b) MX</w:t>
       </w:r>
     </w:p>
     <w:p>
@@ -755,7 +905,7 @@
         <w:t xml:space="preserve">13. </w:t>
       </w:r>
       <w:r>
-        <w:t>Zuzena: c) Hostname bat beste domeinu-izen batera (alias) lotzen du.</w:t>
+        <w:t xml:space="preserve"> Zuzena: c) Hostname bat beste domeinu-izen batera (alias) lotzen du.</w:t>
       </w:r>
     </w:p>
     <w:p>
@@ -783,7 +933,7 @@
         <w:t xml:space="preserve">14. </w:t>
       </w:r>
       <w:r>
-        <w:t>Zuzena: a) Zenbat denboraz cachean gorde daitekeen DNS erregistro bat.</w:t>
+        <w:t xml:space="preserve"> [praktikoa] Zuzena: a) 3600 segundo</w:t>
       </w:r>
     </w:p>
     <w:p>
@@ -791,7 +941,7 @@
         <w:pStyle w:val="ListBullet"/>
       </w:pPr>
       <w:r>
-        <w:t xml:space="preserve">   · Akats txikia: c) Zenbat denboraz cachean gorde daitekeen, baina soilik MX erregistroetan.</w:t>
+        <w:t xml:space="preserve">   · Akats txikia: b) 10 segundo (IP-aren azken oktetoa)</w:t>
       </w:r>
     </w:p>
     <w:p>
@@ -799,7 +949,7 @@
         <w:pStyle w:val="ListBullet"/>
       </w:pPr>
       <w:r>
-        <w:t xml:space="preserve">   · Akats handia: b) Domeinuaren erregistroaren iraungitze-data WHOIS-en.</w:t>
+        <w:t xml:space="preserve">   · Akats handia: c) 53 segundo (DNS ataka)</w:t>
       </w:r>
     </w:p>
     <w:p/>
@@ -811,7 +961,7 @@
         <w:t xml:space="preserve">15. </w:t>
       </w:r>
       <w:r>
-        <w:t>Zuzena: b) Authoritative (agintaritza-zerbitzaria)</w:t>
+        <w:t xml:space="preserve"> Zuzena: b) Authoritative (agintaritza-zerbitzaria)</w:t>
       </w:r>
     </w:p>
     <w:p>

</xml_diff>